<commit_message>
added the code to the reports
</commit_message>
<xml_diff>
--- a/lab1/Lab1_CereteuMaxim_FAF-243.docx
+++ b/lab1/Lab1_CereteuMaxim_FAF-243.docx
@@ -381,6 +381,742 @@
       </w:r>
       <w:r>
         <w:t>.</w:t>
+      </w:r>
+    </w:p>
+    <w:p>
+      <w:pPr>
+        <w:ind w:firstLine="567"/>
+        <w:jc w:val="both"/>
+      </w:pPr>
+      <w:r>
+        <w:t xml:space="preserve">Toate comenzile laboratorului sunt adunate în scriptul </w:t>
+      </w:r>
+      <w:r>
+        <w:rPr>
+          <w:rFonts w:ascii="Consolas" w:hAnsi="Consolas"/>
+          <w:sz w:val="21"/>
+        </w:rPr>
+        <w:t>commands.sh</w:t>
+      </w:r>
+      <w:r>
+        <w:t>, împărțit în părți (câte o resursă în fiecare parte), iar figurile de mai jos arată rezultatul fiecărei părți.</w:t>
+      </w:r>
+    </w:p>
+    <w:tbl>
+      <w:tblPr>
+        <w:tblW w:type="auto" w:w="0"/>
+        <w:jc w:val="center"/>
+        <w:tblLook w:firstColumn="1" w:firstRow="1" w:lastColumn="0" w:lastRow="0" w:noHBand="0" w:noVBand="1" w:val="04A0"/>
+      </w:tblPr>
+      <w:tblGrid>
+        <w:gridCol w:w="9639"/>
+      </w:tblGrid>
+      <w:tr>
+        <w:tc>
+          <w:tcPr>
+            <w:tcW w:type="dxa" w:w="9639"/>
+            <w:shd w:val="clear" w:color="auto" w:fill="F3F3F3"/>
+          </w:tcPr>
+          <w:p>
+            <w:pPr>
+              <w:spacing w:after="0" w:line="240" w:lineRule="auto"/>
+            </w:pPr>
+            <w:r>
+              <w:rPr>
+                <w:rFonts w:ascii="Consolas" w:hAnsi="Consolas"/>
+                <w:color w:val="888888"/>
+                <w:sz w:val="17"/>
+              </w:rPr>
+              <w:t xml:space="preserve"> 1  </w:t>
+            </w:r>
+            <w:r>
+              <w:rPr>
+                <w:rFonts w:ascii="Consolas" w:hAnsi="Consolas"/>
+                <w:sz w:val="17"/>
+              </w:rPr>
+              <w:t>#!/bin/bash</w:t>
+              <w:br/>
+            </w:r>
+            <w:r>
+              <w:rPr>
+                <w:rFonts w:ascii="Consolas" w:hAnsi="Consolas"/>
+                <w:color w:val="888888"/>
+                <w:sz w:val="17"/>
+              </w:rPr>
+              <w:t xml:space="preserve"> 2  </w:t>
+            </w:r>
+            <w:r>
+              <w:rPr>
+                <w:rFonts w:ascii="Consolas" w:hAnsi="Consolas"/>
+                <w:sz w:val="17"/>
+              </w:rPr>
+              <w:t># Lab 1 -- the operating system as a resource manager.</w:t>
+              <w:br/>
+            </w:r>
+            <w:r>
+              <w:rPr>
+                <w:rFonts w:ascii="Consolas" w:hAnsi="Consolas"/>
+                <w:color w:val="888888"/>
+                <w:sz w:val="17"/>
+              </w:rPr>
+              <w:t xml:space="preserve"> 3  </w:t>
+            </w:r>
+            <w:r>
+              <w:rPr>
+                <w:rFonts w:ascii="Consolas" w:hAnsi="Consolas"/>
+                <w:sz w:val="17"/>
+              </w:rPr>
+              <w:t># Each part looks at one resource the kernel hands out: files, CPU time</w:t>
+              <w:br/>
+            </w:r>
+            <w:r>
+              <w:rPr>
+                <w:rFonts w:ascii="Consolas" w:hAnsi="Consolas"/>
+                <w:color w:val="888888"/>
+                <w:sz w:val="17"/>
+              </w:rPr>
+              <w:t xml:space="preserve"> 4  </w:t>
+            </w:r>
+            <w:r>
+              <w:rPr>
+                <w:rFonts w:ascii="Consolas" w:hAnsi="Consolas"/>
+                <w:sz w:val="17"/>
+              </w:rPr>
+              <w:t># (processes), memory and devices.  Safe to run more than once.</w:t>
+              <w:br/>
+            </w:r>
+            <w:r>
+              <w:rPr>
+                <w:rFonts w:ascii="Consolas" w:hAnsi="Consolas"/>
+                <w:color w:val="888888"/>
+                <w:sz w:val="17"/>
+              </w:rPr>
+              <w:t xml:space="preserve"> 5  </w:t>
+            </w:r>
+            <w:r>
+              <w:rPr>
+                <w:rFonts w:ascii="Consolas" w:hAnsi="Consolas"/>
+                <w:sz w:val="17"/>
+              </w:rPr>
+              <w:br/>
+            </w:r>
+            <w:r>
+              <w:rPr>
+                <w:rFonts w:ascii="Consolas" w:hAnsi="Consolas"/>
+                <w:color w:val="888888"/>
+                <w:sz w:val="17"/>
+              </w:rPr>
+              <w:t xml:space="preserve"> 6  </w:t>
+            </w:r>
+            <w:r>
+              <w:rPr>
+                <w:rFonts w:ascii="Consolas" w:hAnsi="Consolas"/>
+                <w:sz w:val="17"/>
+              </w:rPr>
+              <w:t>WORK=$HOME/os-lab1</w:t>
+              <w:br/>
+            </w:r>
+            <w:r>
+              <w:rPr>
+                <w:rFonts w:ascii="Consolas" w:hAnsi="Consolas"/>
+                <w:color w:val="888888"/>
+                <w:sz w:val="17"/>
+              </w:rPr>
+              <w:t xml:space="preserve"> 7  </w:t>
+            </w:r>
+            <w:r>
+              <w:rPr>
+                <w:rFonts w:ascii="Consolas" w:hAnsi="Consolas"/>
+                <w:sz w:val="17"/>
+              </w:rPr>
+              <w:t>section() { printf '\n===== %s =====\n' "$*"; }</w:t>
+              <w:br/>
+            </w:r>
+            <w:r>
+              <w:rPr>
+                <w:rFonts w:ascii="Consolas" w:hAnsi="Consolas"/>
+                <w:color w:val="888888"/>
+                <w:sz w:val="17"/>
+              </w:rPr>
+              <w:t xml:space="preserve"> 8  </w:t>
+            </w:r>
+            <w:r>
+              <w:rPr>
+                <w:rFonts w:ascii="Consolas" w:hAnsi="Consolas"/>
+                <w:sz w:val="17"/>
+              </w:rPr>
+              <w:br/>
+            </w:r>
+            <w:r>
+              <w:rPr>
+                <w:rFonts w:ascii="Consolas" w:hAnsi="Consolas"/>
+                <w:color w:val="888888"/>
+                <w:sz w:val="17"/>
+              </w:rPr>
+              <w:t xml:space="preserve"> 9  </w:t>
+            </w:r>
+            <w:r>
+              <w:rPr>
+                <w:rFonts w:ascii="Consolas" w:hAnsi="Consolas"/>
+                <w:sz w:val="17"/>
+              </w:rPr>
+              <w:t>section "Machine"</w:t>
+              <w:br/>
+            </w:r>
+            <w:r>
+              <w:rPr>
+                <w:rFonts w:ascii="Consolas" w:hAnsi="Consolas"/>
+                <w:color w:val="888888"/>
+                <w:sz w:val="17"/>
+              </w:rPr>
+              <w:t xml:space="preserve">10  </w:t>
+            </w:r>
+            <w:r>
+              <w:rPr>
+                <w:rFonts w:ascii="Consolas" w:hAnsi="Consolas"/>
+                <w:sz w:val="17"/>
+              </w:rPr>
+              <w:t>echo "user: $(whoami)   host: $(hostname)"</w:t>
+              <w:br/>
+            </w:r>
+            <w:r>
+              <w:rPr>
+                <w:rFonts w:ascii="Consolas" w:hAnsi="Consolas"/>
+                <w:color w:val="888888"/>
+                <w:sz w:val="17"/>
+              </w:rPr>
+              <w:t xml:space="preserve">11  </w:t>
+            </w:r>
+            <w:r>
+              <w:rPr>
+                <w:rFonts w:ascii="Consolas" w:hAnsi="Consolas"/>
+                <w:sz w:val="17"/>
+              </w:rPr>
+              <w:t>uname -srm</w:t>
+              <w:br/>
+            </w:r>
+            <w:r>
+              <w:rPr>
+                <w:rFonts w:ascii="Consolas" w:hAnsi="Consolas"/>
+                <w:color w:val="888888"/>
+                <w:sz w:val="17"/>
+              </w:rPr>
+              <w:t xml:space="preserve">12  </w:t>
+            </w:r>
+            <w:r>
+              <w:rPr>
+                <w:rFonts w:ascii="Consolas" w:hAnsi="Consolas"/>
+                <w:sz w:val="17"/>
+              </w:rPr>
+              <w:t>uptime -p</w:t>
+              <w:br/>
+            </w:r>
+            <w:r>
+              <w:rPr>
+                <w:rFonts w:ascii="Consolas" w:hAnsi="Consolas"/>
+                <w:color w:val="888888"/>
+                <w:sz w:val="17"/>
+              </w:rPr>
+              <w:t xml:space="preserve">13  </w:t>
+            </w:r>
+            <w:r>
+              <w:rPr>
+                <w:rFonts w:ascii="Consolas" w:hAnsi="Consolas"/>
+                <w:sz w:val="17"/>
+              </w:rPr>
+              <w:br/>
+            </w:r>
+            <w:r>
+              <w:rPr>
+                <w:rFonts w:ascii="Consolas" w:hAnsi="Consolas"/>
+                <w:color w:val="888888"/>
+                <w:sz w:val="17"/>
+              </w:rPr>
+              <w:t xml:space="preserve">14  </w:t>
+            </w:r>
+            <w:r>
+              <w:rPr>
+                <w:rFonts w:ascii="Consolas" w:hAnsi="Consolas"/>
+                <w:sz w:val="17"/>
+              </w:rPr>
+              <w:t>section "Part 1 - files and directories"</w:t>
+              <w:br/>
+            </w:r>
+            <w:r>
+              <w:rPr>
+                <w:rFonts w:ascii="Consolas" w:hAnsi="Consolas"/>
+                <w:color w:val="888888"/>
+                <w:sz w:val="17"/>
+              </w:rPr>
+              <w:t xml:space="preserve">15  </w:t>
+            </w:r>
+            <w:r>
+              <w:rPr>
+                <w:rFonts w:ascii="Consolas" w:hAnsi="Consolas"/>
+                <w:sz w:val="17"/>
+              </w:rPr>
+              <w:t>rm -rf "$WORK" &amp;&amp; mkdir -p "$WORK/demo" &amp;&amp; cd "$WORK/demo" || exit 1</w:t>
+              <w:br/>
+            </w:r>
+            <w:r>
+              <w:rPr>
+                <w:rFonts w:ascii="Consolas" w:hAnsi="Consolas"/>
+                <w:color w:val="888888"/>
+                <w:sz w:val="17"/>
+              </w:rPr>
+              <w:t xml:space="preserve">16  </w:t>
+            </w:r>
+            <w:r>
+              <w:rPr>
+                <w:rFonts w:ascii="Consolas" w:hAnsi="Consolas"/>
+                <w:sz w:val="17"/>
+              </w:rPr>
+              <w:t>echo "hello operating systems" &gt; note.txt</w:t>
+              <w:br/>
+            </w:r>
+            <w:r>
+              <w:rPr>
+                <w:rFonts w:ascii="Consolas" w:hAnsi="Consolas"/>
+                <w:color w:val="888888"/>
+                <w:sz w:val="17"/>
+              </w:rPr>
+              <w:t xml:space="preserve">17  </w:t>
+            </w:r>
+            <w:r>
+              <w:rPr>
+                <w:rFonts w:ascii="Consolas" w:hAnsi="Consolas"/>
+                <w:sz w:val="17"/>
+              </w:rPr>
+              <w:t>cp note.txt copy.txt</w:t>
+              <w:br/>
+            </w:r>
+            <w:r>
+              <w:rPr>
+                <w:rFonts w:ascii="Consolas" w:hAnsi="Consolas"/>
+                <w:color w:val="888888"/>
+                <w:sz w:val="17"/>
+              </w:rPr>
+              <w:t xml:space="preserve">18  </w:t>
+            </w:r>
+            <w:r>
+              <w:rPr>
+                <w:rFonts w:ascii="Consolas" w:hAnsi="Consolas"/>
+                <w:sz w:val="17"/>
+              </w:rPr>
+              <w:t>mv copy.txt renamed.txt</w:t>
+              <w:br/>
+            </w:r>
+            <w:r>
+              <w:rPr>
+                <w:rFonts w:ascii="Consolas" w:hAnsi="Consolas"/>
+                <w:color w:val="888888"/>
+                <w:sz w:val="17"/>
+              </w:rPr>
+              <w:t xml:space="preserve">19  </w:t>
+            </w:r>
+            <w:r>
+              <w:rPr>
+                <w:rFonts w:ascii="Consolas" w:hAnsi="Consolas"/>
+                <w:sz w:val="17"/>
+              </w:rPr>
+              <w:t>ls -l</w:t>
+              <w:br/>
+            </w:r>
+            <w:r>
+              <w:rPr>
+                <w:rFonts w:ascii="Consolas" w:hAnsi="Consolas"/>
+                <w:color w:val="888888"/>
+                <w:sz w:val="17"/>
+              </w:rPr>
+              <w:t xml:space="preserve">20  </w:t>
+            </w:r>
+            <w:r>
+              <w:rPr>
+                <w:rFonts w:ascii="Consolas" w:hAnsi="Consolas"/>
+                <w:sz w:val="17"/>
+              </w:rPr>
+              <w:t>chmod 600 note.txt</w:t>
+              <w:br/>
+            </w:r>
+            <w:r>
+              <w:rPr>
+                <w:rFonts w:ascii="Consolas" w:hAnsi="Consolas"/>
+                <w:color w:val="888888"/>
+                <w:sz w:val="17"/>
+              </w:rPr>
+              <w:t xml:space="preserve">21  </w:t>
+            </w:r>
+            <w:r>
+              <w:rPr>
+                <w:rFonts w:ascii="Consolas" w:hAnsi="Consolas"/>
+                <w:sz w:val="17"/>
+              </w:rPr>
+              <w:t>ls -l note.txt</w:t>
+              <w:br/>
+            </w:r>
+            <w:r>
+              <w:rPr>
+                <w:rFonts w:ascii="Consolas" w:hAnsi="Consolas"/>
+                <w:color w:val="888888"/>
+                <w:sz w:val="17"/>
+              </w:rPr>
+              <w:t xml:space="preserve">22  </w:t>
+            </w:r>
+            <w:r>
+              <w:rPr>
+                <w:rFonts w:ascii="Consolas" w:hAnsi="Consolas"/>
+                <w:sz w:val="17"/>
+              </w:rPr>
+              <w:t>ls -ld /etc /dev /home /usr</w:t>
+              <w:br/>
+            </w:r>
+            <w:r>
+              <w:rPr>
+                <w:rFonts w:ascii="Consolas" w:hAnsi="Consolas"/>
+                <w:color w:val="888888"/>
+                <w:sz w:val="17"/>
+              </w:rPr>
+              <w:t xml:space="preserve">23  </w:t>
+            </w:r>
+            <w:r>
+              <w:rPr>
+                <w:rFonts w:ascii="Consolas" w:hAnsi="Consolas"/>
+                <w:sz w:val="17"/>
+              </w:rPr>
+              <w:br/>
+            </w:r>
+            <w:r>
+              <w:rPr>
+                <w:rFonts w:ascii="Consolas" w:hAnsi="Consolas"/>
+                <w:color w:val="888888"/>
+                <w:sz w:val="17"/>
+              </w:rPr>
+              <w:t xml:space="preserve">24  </w:t>
+            </w:r>
+            <w:r>
+              <w:rPr>
+                <w:rFonts w:ascii="Consolas" w:hAnsi="Consolas"/>
+                <w:sz w:val="17"/>
+              </w:rPr>
+              <w:t>section "Part 2 - processes"</w:t>
+              <w:br/>
+            </w:r>
+            <w:r>
+              <w:rPr>
+                <w:rFonts w:ascii="Consolas" w:hAnsi="Consolas"/>
+                <w:color w:val="888888"/>
+                <w:sz w:val="17"/>
+              </w:rPr>
+              <w:t xml:space="preserve">25  </w:t>
+            </w:r>
+            <w:r>
+              <w:rPr>
+                <w:rFonts w:ascii="Consolas" w:hAnsi="Consolas"/>
+                <w:sz w:val="17"/>
+              </w:rPr>
+              <w:t>ps -o pid,ppid,user,comm -p 1</w:t>
+              <w:br/>
+            </w:r>
+            <w:r>
+              <w:rPr>
+                <w:rFonts w:ascii="Consolas" w:hAnsi="Consolas"/>
+                <w:color w:val="888888"/>
+                <w:sz w:val="17"/>
+              </w:rPr>
+              <w:t xml:space="preserve">26  </w:t>
+            </w:r>
+            <w:r>
+              <w:rPr>
+                <w:rFonts w:ascii="Consolas" w:hAnsi="Consolas"/>
+                <w:sz w:val="17"/>
+              </w:rPr>
+              <w:t>ls -l /sbin/init</w:t>
+              <w:br/>
+            </w:r>
+            <w:r>
+              <w:rPr>
+                <w:rFonts w:ascii="Consolas" w:hAnsi="Consolas"/>
+                <w:color w:val="888888"/>
+                <w:sz w:val="17"/>
+              </w:rPr>
+              <w:t xml:space="preserve">27  </w:t>
+            </w:r>
+            <w:r>
+              <w:rPr>
+                <w:rFonts w:ascii="Consolas" w:hAnsi="Consolas"/>
+                <w:sz w:val="17"/>
+              </w:rPr>
+              <w:t>echo "processes right now: $(ps -e --no-headers | wc -l)"</w:t>
+              <w:br/>
+            </w:r>
+            <w:r>
+              <w:rPr>
+                <w:rFonts w:ascii="Consolas" w:hAnsi="Consolas"/>
+                <w:color w:val="888888"/>
+                <w:sz w:val="17"/>
+              </w:rPr>
+              <w:t xml:space="preserve">28  </w:t>
+            </w:r>
+            <w:r>
+              <w:rPr>
+                <w:rFonts w:ascii="Consolas" w:hAnsi="Consolas"/>
+                <w:sz w:val="17"/>
+              </w:rPr>
+              <w:t>sleep 300 &amp;</w:t>
+              <w:br/>
+            </w:r>
+            <w:r>
+              <w:rPr>
+                <w:rFonts w:ascii="Consolas" w:hAnsi="Consolas"/>
+                <w:color w:val="888888"/>
+                <w:sz w:val="17"/>
+              </w:rPr>
+              <w:t xml:space="preserve">29  </w:t>
+            </w:r>
+            <w:r>
+              <w:rPr>
+                <w:rFonts w:ascii="Consolas" w:hAnsi="Consolas"/>
+                <w:sz w:val="17"/>
+              </w:rPr>
+              <w:t>SPID=$!</w:t>
+              <w:br/>
+            </w:r>
+            <w:r>
+              <w:rPr>
+                <w:rFonts w:ascii="Consolas" w:hAnsi="Consolas"/>
+                <w:color w:val="888888"/>
+                <w:sz w:val="17"/>
+              </w:rPr>
+              <w:t xml:space="preserve">30  </w:t>
+            </w:r>
+            <w:r>
+              <w:rPr>
+                <w:rFonts w:ascii="Consolas" w:hAnsi="Consolas"/>
+                <w:sz w:val="17"/>
+              </w:rPr>
+              <w:t>grep -E '^(Name|State|PPid)' /proc/$SPID/status</w:t>
+              <w:br/>
+            </w:r>
+            <w:r>
+              <w:rPr>
+                <w:rFonts w:ascii="Consolas" w:hAnsi="Consolas"/>
+                <w:color w:val="888888"/>
+                <w:sz w:val="17"/>
+              </w:rPr>
+              <w:t xml:space="preserve">31  </w:t>
+            </w:r>
+            <w:r>
+              <w:rPr>
+                <w:rFonts w:ascii="Consolas" w:hAnsi="Consolas"/>
+                <w:sz w:val="17"/>
+              </w:rPr>
+              <w:t>top -b -n 1 | head -n 5</w:t>
+              <w:br/>
+            </w:r>
+            <w:r>
+              <w:rPr>
+                <w:rFonts w:ascii="Consolas" w:hAnsi="Consolas"/>
+                <w:color w:val="888888"/>
+                <w:sz w:val="17"/>
+              </w:rPr>
+              <w:t xml:space="preserve">32  </w:t>
+            </w:r>
+            <w:r>
+              <w:rPr>
+                <w:rFonts w:ascii="Consolas" w:hAnsi="Consolas"/>
+                <w:sz w:val="17"/>
+              </w:rPr>
+              <w:br/>
+            </w:r>
+            <w:r>
+              <w:rPr>
+                <w:rFonts w:ascii="Consolas" w:hAnsi="Consolas"/>
+                <w:color w:val="888888"/>
+                <w:sz w:val="17"/>
+              </w:rPr>
+              <w:t xml:space="preserve">33  </w:t>
+            </w:r>
+            <w:r>
+              <w:rPr>
+                <w:rFonts w:ascii="Consolas" w:hAnsi="Consolas"/>
+                <w:sz w:val="17"/>
+              </w:rPr>
+              <w:t>section "Part 3 - memory"</w:t>
+              <w:br/>
+            </w:r>
+            <w:r>
+              <w:rPr>
+                <w:rFonts w:ascii="Consolas" w:hAnsi="Consolas"/>
+                <w:color w:val="888888"/>
+                <w:sz w:val="17"/>
+              </w:rPr>
+              <w:t xml:space="preserve">34  </w:t>
+            </w:r>
+            <w:r>
+              <w:rPr>
+                <w:rFonts w:ascii="Consolas" w:hAnsi="Consolas"/>
+                <w:sz w:val="17"/>
+              </w:rPr>
+              <w:t>free -h</w:t>
+              <w:br/>
+            </w:r>
+            <w:r>
+              <w:rPr>
+                <w:rFonts w:ascii="Consolas" w:hAnsi="Consolas"/>
+                <w:color w:val="888888"/>
+                <w:sz w:val="17"/>
+              </w:rPr>
+              <w:t xml:space="preserve">35  </w:t>
+            </w:r>
+            <w:r>
+              <w:rPr>
+                <w:rFonts w:ascii="Consolas" w:hAnsi="Consolas"/>
+                <w:sz w:val="17"/>
+              </w:rPr>
+              <w:t>swapon --show</w:t>
+              <w:br/>
+            </w:r>
+            <w:r>
+              <w:rPr>
+                <w:rFonts w:ascii="Consolas" w:hAnsi="Consolas"/>
+                <w:color w:val="888888"/>
+                <w:sz w:val="17"/>
+              </w:rPr>
+              <w:t xml:space="preserve">36  </w:t>
+            </w:r>
+            <w:r>
+              <w:rPr>
+                <w:rFonts w:ascii="Consolas" w:hAnsi="Consolas"/>
+                <w:sz w:val="17"/>
+              </w:rPr>
+              <w:t>grep -E '^Vm(Size|RSS)' /proc/$SPID/status</w:t>
+              <w:br/>
+            </w:r>
+            <w:r>
+              <w:rPr>
+                <w:rFonts w:ascii="Consolas" w:hAnsi="Consolas"/>
+                <w:color w:val="888888"/>
+                <w:sz w:val="17"/>
+              </w:rPr>
+              <w:t xml:space="preserve">37  </w:t>
+            </w:r>
+            <w:r>
+              <w:rPr>
+                <w:rFonts w:ascii="Consolas" w:hAnsi="Consolas"/>
+                <w:sz w:val="17"/>
+              </w:rPr>
+              <w:t>kill $SPID</w:t>
+              <w:br/>
+            </w:r>
+            <w:r>
+              <w:rPr>
+                <w:rFonts w:ascii="Consolas" w:hAnsi="Consolas"/>
+                <w:color w:val="888888"/>
+                <w:sz w:val="17"/>
+              </w:rPr>
+              <w:t xml:space="preserve">38  </w:t>
+            </w:r>
+            <w:r>
+              <w:rPr>
+                <w:rFonts w:ascii="Consolas" w:hAnsi="Consolas"/>
+                <w:sz w:val="17"/>
+              </w:rPr>
+              <w:br/>
+            </w:r>
+            <w:r>
+              <w:rPr>
+                <w:rFonts w:ascii="Consolas" w:hAnsi="Consolas"/>
+                <w:color w:val="888888"/>
+                <w:sz w:val="17"/>
+              </w:rPr>
+              <w:t xml:space="preserve">39  </w:t>
+            </w:r>
+            <w:r>
+              <w:rPr>
+                <w:rFonts w:ascii="Consolas" w:hAnsi="Consolas"/>
+                <w:sz w:val="17"/>
+              </w:rPr>
+              <w:t>section "Part 4 - devices and storage"</w:t>
+              <w:br/>
+            </w:r>
+            <w:r>
+              <w:rPr>
+                <w:rFonts w:ascii="Consolas" w:hAnsi="Consolas"/>
+                <w:color w:val="888888"/>
+                <w:sz w:val="17"/>
+              </w:rPr>
+              <w:t xml:space="preserve">40  </w:t>
+            </w:r>
+            <w:r>
+              <w:rPr>
+                <w:rFonts w:ascii="Consolas" w:hAnsi="Consolas"/>
+                <w:sz w:val="17"/>
+              </w:rPr>
+              <w:t>ls -l /dev | head -n 6</w:t>
+              <w:br/>
+            </w:r>
+            <w:r>
+              <w:rPr>
+                <w:rFonts w:ascii="Consolas" w:hAnsi="Consolas"/>
+                <w:color w:val="888888"/>
+                <w:sz w:val="17"/>
+              </w:rPr>
+              <w:t xml:space="preserve">41  </w:t>
+            </w:r>
+            <w:r>
+              <w:rPr>
+                <w:rFonts w:ascii="Consolas" w:hAnsi="Consolas"/>
+                <w:sz w:val="17"/>
+              </w:rPr>
+              <w:t>ls -l /dev/null /dev/tty /dev/sda 2&gt;/dev/null</w:t>
+              <w:br/>
+            </w:r>
+            <w:r>
+              <w:rPr>
+                <w:rFonts w:ascii="Consolas" w:hAnsi="Consolas"/>
+                <w:color w:val="888888"/>
+                <w:sz w:val="17"/>
+              </w:rPr>
+              <w:t xml:space="preserve">42  </w:t>
+            </w:r>
+            <w:r>
+              <w:rPr>
+                <w:rFonts w:ascii="Consolas" w:hAnsi="Consolas"/>
+                <w:sz w:val="17"/>
+              </w:rPr>
+              <w:t>lsblk -o NAME,SIZE,TYPE,MOUNTPOINTS</w:t>
+              <w:br/>
+            </w:r>
+            <w:r>
+              <w:rPr>
+                <w:rFonts w:ascii="Consolas" w:hAnsi="Consolas"/>
+                <w:color w:val="888888"/>
+                <w:sz w:val="17"/>
+              </w:rPr>
+              <w:t xml:space="preserve">43  </w:t>
+            </w:r>
+            <w:r>
+              <w:rPr>
+                <w:rFonts w:ascii="Consolas" w:hAnsi="Consolas"/>
+                <w:sz w:val="17"/>
+              </w:rPr>
+              <w:t>findmnt -n -o SOURCE,FSTYPE /</w:t>
+            </w:r>
+          </w:p>
+        </w:tc>
+      </w:tr>
+    </w:tbl>
+    <w:p>
+      <w:pPr>
+        <w:spacing w:before="60" w:after="200"/>
+        <w:jc w:val="center"/>
+      </w:pPr>
+      <w:r>
+        <w:rPr>
+          <w:i/>
+          <w:sz w:val="21"/>
+        </w:rPr>
+        <w:t>Listing 1.1 – commands.sh – comenzile laboratorului 1</w:t>
       </w:r>
     </w:p>
     <w:p>

</xml_diff>